<commit_message>
Dùng bộ số 3D 0–9 và chữ giờ/phút/giây của designer
Số hai chữ số được dời sang phải để không đè chữ "còn". Font SVN-Gilroy Black
là font thương mại nên chỉ có trong gói zip bàn giao, không đưa lên repo.

Co-Authored-By: Claude Opus 5.5 <noreply@anthropic.com>
</commit_message>
<xml_diff>
--- a/HUONG-DAN-TRIEN-KHAI.docx
+++ b/HUONG-DAN-TRIEN-KHAI.docx
@@ -580,7 +580,7 @@
               <w:rPr>
                 <w:rFonts w:ascii="Arial" w:cs="Arial" w:eastAsia="Arial" w:hAnsi="Arial"/>
               </w:rPr>
-              <w:t xml:space="preserve">Tách từ file thiết kế gốc Countdown.ai (ảnh nền, tòa nhà, chữ 3D, logo)</w:t>
+              <w:t xml:space="preserve">Tách từ file thiết kế gốc Countdown.ai (ảnh nền, tòa nhà, chữ 3D, logo); bộ số 3D 0–9 và chữ giờ/phút/giây do designer cung cấp</w:t>
             </w:r>
           </w:p>
         </w:tc>
@@ -846,7 +846,7 @@
               <w:rPr>
                 <w:rFonts w:ascii="Arial" w:cs="Arial" w:eastAsia="Arial" w:hAnsi="Arial"/>
               </w:rPr>
-              <w:t xml:space="preserve">Ảnh nền, hình tòa nhà, chữ 3D "còn", "ngày" và số "3"</w:t>
+              <w:t xml:space="preserve">Ảnh nền, hình tòa nhà, bộ số 3D so-0.png … so-9.png, chữ 3D "còn", "ngày", "giờ", "phút", "giây"</w:t>
             </w:r>
           </w:p>
         </w:tc>
@@ -970,7 +970,7 @@
               <w:rPr>
                 <w:rFonts w:ascii="Arial" w:cs="Arial" w:eastAsia="Arial" w:hAnsi="Arial"/>
               </w:rPr>
-              <w:t xml:space="preserve">Font Montserrat (giấy phép OFL, miễn phí) để chạy không cần mạng</w:t>
+              <w:t xml:space="preserve">Font SVN-Gilroy Black (tiêu đề, địa điểm) và Montserrat (các chữ còn lại) để chạy không cần mạng</w:t>
             </w:r>
           </w:p>
         </w:tc>
@@ -3775,7 +3775,7 @@
               <w:rPr>
                 <w:rFonts w:ascii="Arial" w:cs="Arial" w:eastAsia="Arial" w:hAnsi="Arial"/>
               </w:rPr>
-              <w:t xml:space="preserve">Chữ số 3D cho mọi số</w:t>
+              <w:t xml:space="preserve">Kiểu chữ số 3D</w:t>
             </w:r>
           </w:p>
         </w:tc>
@@ -3803,7 +3803,7 @@
               <w:rPr>
                 <w:rFonts w:ascii="Arial" w:cs="Arial" w:eastAsia="Arial" w:hAnsi="Arial"/>
               </w:rPr>
-              <w:t xml:space="preserve">Đặt 10 file </w:t>
+              <w:t xml:space="preserve">Thay các file </w:t>
             </w:r>
             <w:r>
               <w:rPr>
@@ -3833,7 +3833,7 @@
               <w:rPr>
                 <w:rFonts w:ascii="Arial" w:cs="Arial" w:eastAsia="Arial" w:hAnsi="Arial"/>
               </w:rPr>
-              <w:t xml:space="preserve"> (PNG nền trong suốt) vào assets/. Trang tự dùng khi đủ bộ số cần hiển thị</w:t>
+              <w:t xml:space="preserve"> trong assets/ (PNG nền trong suốt, cùng khổ cho cả 10 số). Thiếu file nào thì trang tự dùng chữ thay thế cho số đó</w:t>
             </w:r>
           </w:p>
         </w:tc>
@@ -3867,7 +3867,7 @@
               <w:rPr>
                 <w:rFonts w:ascii="Arial" w:cs="Arial" w:eastAsia="Arial" w:hAnsi="Arial"/>
               </w:rPr>
-              <w:t xml:space="preserve">Chữ 3D giờ/phút/giây</w:t>
+              <w:t xml:space="preserve">Chữ 3D ngày/giờ/phút/giây</w:t>
             </w:r>
           </w:p>
         </w:tc>
@@ -3896,7 +3896,7 @@
               <w:rPr>
                 <w:rFonts w:ascii="Arial" w:cs="Arial" w:eastAsia="Arial" w:hAnsi="Arial"/>
               </w:rPr>
-              <w:t xml:space="preserve">Đặt </w:t>
+              <w:t xml:space="preserve">Thay các file </w:t>
             </w:r>
             <w:r>
               <w:rPr>
@@ -3905,7 +3905,7 @@
                 <w:sz w:val="19"/>
                 <w:szCs w:val="19"/>
               </w:rPr>
-              <w:t xml:space="preserve">gio.png</w:t>
+              <w:t xml:space="preserve">ngay.png</w:t>
             </w:r>
             <w:r>
               <w:rPr>
@@ -3920,7 +3920,7 @@
                 <w:sz w:val="19"/>
                 <w:szCs w:val="19"/>
               </w:rPr>
-              <w:t xml:space="preserve">phut.png</w:t>
+              <w:t xml:space="preserve">gio.png</w:t>
             </w:r>
             <w:r>
               <w:rPr>
@@ -3935,13 +3935,28 @@
                 <w:sz w:val="19"/>
                 <w:szCs w:val="19"/>
               </w:rPr>
+              <w:t xml:space="preserve">phut.png</w:t>
+            </w:r>
+            <w:r>
+              <w:rPr>
+                <w:rFonts w:ascii="Arial" w:cs="Arial" w:eastAsia="Arial" w:hAnsi="Arial"/>
+              </w:rPr>
+              <w:t xml:space="preserve">, </w:t>
+            </w:r>
+            <w:r>
+              <w:rPr>
+                <w:rFonts w:ascii="Consolas" w:cs="Consolas" w:eastAsia="Consolas" w:hAnsi="Consolas"/>
+                <w:color w:val="1F2D5A"/>
+                <w:sz w:val="19"/>
+                <w:szCs w:val="19"/>
+              </w:rPr>
               <w:t xml:space="preserve">giay.png</w:t>
             </w:r>
             <w:r>
               <w:rPr>
                 <w:rFonts w:ascii="Arial" w:cs="Arial" w:eastAsia="Arial" w:hAnsi="Arial"/>
               </w:rPr>
-              <w:t xml:space="preserve"> vào assets/</w:t>
+              <w:t xml:space="preserve"> trong assets/</w:t>
             </w:r>
           </w:p>
         </w:tc>
@@ -3974,7 +3989,7 @@
               <w:rPr>
                 <w:rFonts w:ascii="Arial" w:cs="Arial" w:eastAsia="Arial" w:hAnsi="Arial"/>
               </w:rPr>
-              <w:t xml:space="preserve">Font SVN-Gilroy Black</w:t>
+              <w:t xml:space="preserve">Font chữ</w:t>
             </w:r>
           </w:p>
         </w:tc>
@@ -4002,7 +4017,7 @@
               <w:rPr>
                 <w:rFonts w:ascii="Arial" w:cs="Arial" w:eastAsia="Arial" w:hAnsi="Arial"/>
               </w:rPr>
-              <w:t xml:space="preserve">Font có bản quyền, chưa kèm theo. Khi có file, đặt </w:t>
+              <w:t xml:space="preserve">Font nằm trong fonts/. Nếu thiếu </w:t>
             </w:r>
             <w:r>
               <w:rPr>
@@ -4017,7 +4032,7 @@
               <w:rPr>
                 <w:rFonts w:ascii="Arial" w:cs="Arial" w:eastAsia="Arial" w:hAnsi="Arial"/>
               </w:rPr>
-              <w:t xml:space="preserve"> vào fonts/ hoặc cài lên máy. Khi chưa có, trang dùng Montserrat thay thế</w:t>
+              <w:t xml:space="preserve">, trang tự dùng Montserrat thay thế</w:t>
             </w:r>
           </w:p>
         </w:tc>
@@ -4510,7 +4525,7 @@
               <w:rPr>
                 <w:rFonts w:ascii="Arial" w:cs="Arial" w:eastAsia="Arial" w:hAnsi="Arial"/>
               </w:rPr>
-              <w:t xml:space="preserve">Kiểm tra fonts/ có 2 file Montserrat .ttf</w:t>
+              <w:t xml:space="preserve">Kiểm tra fonts/ có đủ SVN-Gilroy-Black.otf và 2 file Montserrat .ttf</w:t>
             </w:r>
           </w:p>
         </w:tc>

</xml_diff>

<commit_message>
Tính "còn … ngày" theo ngày lịch, thay logo Trường và màn hình khai mạc mới
- Số ngày ở chữ lớn tính theo ngày lịch (giờ Việt Nam); khi ô Ngày/Giờ/Phút
  về 0 thì lần lượt chuyển sang giờ/phút/giây
- Thêm tham số &freeze để đứng hình tại thời điểm ?now= khi chụp ảnh
- Logo Trường mới kèm khẩu hiệu "Chất lượng - Sáng tạo - Nhân văn"
- Từ 08g30 ngày 24/10 hiển thị bố cục "KI NIEM-01", giữ dải logo tài trợ

Co-Authored-By: Claude Opus 5.5 <noreply@anthropic.com>
</commit_message>
<xml_diff>
--- a/HUONG-DAN-TRIEN-KHAI.docx
+++ b/HUONG-DAN-TRIEN-KHAI.docx
@@ -2577,7 +2577,7 @@
         <w:rPr>
           <w:rFonts w:ascii="Arial" w:cs="Arial" w:eastAsia="Arial" w:hAnsi="Arial"/>
         </w:rPr>
-        <w:t xml:space="preserve">Số lớn bên trái tự đổi đơn vị theo thời gian còn lại. Bốn ô Ngày, Giờ, Phút, Giây bên phải luôn chạy liên tục.</w:t>
+        <w:t xml:space="preserve">Bốn ô Ngày, Giờ, Phút, Giây bên phải đếm ngược chính xác. Số lớn bên trái đổi đơn vị theo các ô này: ô Ngày về 0 thì chuyển sang giờ, ô Giờ về 0 thì chuyển sang phút, ô Phút về 0 thì chuyển sang giây.</w:t>
       </w:r>
     </w:p>
     <w:tbl>
@@ -2694,7 +2694,7 @@
               <w:rPr>
                 <w:rFonts w:ascii="Arial" w:cs="Arial" w:eastAsia="Arial" w:hAnsi="Arial"/>
               </w:rPr>
-              <w:t xml:space="preserve">Từ 1 ngày trở lên</w:t>
+              <w:t xml:space="preserve">Ô Ngày từ 1 trở lên</w:t>
             </w:r>
           </w:p>
         </w:tc>
@@ -2722,7 +2722,7 @@
               <w:rPr>
                 <w:rFonts w:ascii="Arial" w:cs="Arial" w:eastAsia="Arial" w:hAnsi="Arial"/>
               </w:rPr>
-              <w:t xml:space="preserve">"còn N ngày" (ví dụ: còn 3 ngày)</w:t>
+              <w:t xml:space="preserve">"còn N ngày", N tính theo ngày lịch: hôm nay 22/10 thì hiện "còn 2 ngày" dù đồng hồ còn 1 ngày 12 giờ</w:t>
             </w:r>
           </w:p>
         </w:tc>
@@ -2756,7 +2756,7 @@
               <w:rPr>
                 <w:rFonts w:ascii="Arial" w:cs="Arial" w:eastAsia="Arial" w:hAnsi="Arial"/>
               </w:rPr>
-              <w:t xml:space="preserve">Dưới 1 ngày</w:t>
+              <w:t xml:space="preserve">Ô Ngày = 0</w:t>
             </w:r>
           </w:p>
         </w:tc>
@@ -2785,7 +2785,7 @@
               <w:rPr>
                 <w:rFonts w:ascii="Arial" w:cs="Arial" w:eastAsia="Arial" w:hAnsi="Arial"/>
               </w:rPr>
-              <w:t xml:space="preserve">"còn N giờ"</w:t>
+              <w:t xml:space="preserve">"còn N giờ" (N = ô Giờ)</w:t>
             </w:r>
           </w:p>
         </w:tc>
@@ -2818,7 +2818,7 @@
               <w:rPr>
                 <w:rFonts w:ascii="Arial" w:cs="Arial" w:eastAsia="Arial" w:hAnsi="Arial"/>
               </w:rPr>
-              <w:t xml:space="preserve">Dưới 1 giờ</w:t>
+              <w:t xml:space="preserve">Ô Ngày, Giờ = 0</w:t>
             </w:r>
           </w:p>
         </w:tc>
@@ -2846,7 +2846,7 @@
               <w:rPr>
                 <w:rFonts w:ascii="Arial" w:cs="Arial" w:eastAsia="Arial" w:hAnsi="Arial"/>
               </w:rPr>
-              <w:t xml:space="preserve">"còn N phút"</w:t>
+              <w:t xml:space="preserve">"còn N phút" (N = ô Phút)</w:t>
             </w:r>
           </w:p>
         </w:tc>
@@ -2880,7 +2880,7 @@
               <w:rPr>
                 <w:rFonts w:ascii="Arial" w:cs="Arial" w:eastAsia="Arial" w:hAnsi="Arial"/>
               </w:rPr>
-              <w:t xml:space="preserve">Dưới 1 phút</w:t>
+              <w:t xml:space="preserve">Ô Ngày, Giờ, Phút = 0</w:t>
             </w:r>
           </w:p>
         </w:tc>
@@ -2970,7 +2970,7 @@
               <w:rPr>
                 <w:rFonts w:ascii="Arial" w:cs="Arial" w:eastAsia="Arial" w:hAnsi="Arial"/>
               </w:rPr>
-              <w:t xml:space="preserve">"Chào mừng quý vị đại biểu" và "Lễ kỉ niệm 50 năm Ngày truyền thống đang diễn ra"</w:t>
+              <w:t xml:space="preserve">Màn hình kỉ niệm: logo Trường, logo 50 năm, "Kỉ niệm 50 năm Ngày truyền thống" và "(27/10/1976 - 27/10/2026)". Dải logo tài trợ giữ nguyên</w:t>
             </w:r>
           </w:p>
         </w:tc>
@@ -2986,7 +2986,7 @@
           <wp:inline distT="0" distB="0" distL="0" distR="0">
             <wp:extent cx="6096000" cy="3286125"/>
             <wp:effectExtent t="0" r="0" b="0" l="0"/>
-            <wp:docPr id="2" name="live.jpg" descr="Hình 2. Màn hình tự chuyển sang lời chào khi đến giờ khai mạc" title="Hình 2. Màn hình tự chuyển sang lời chào khi đến giờ khai mạc"/>
+            <wp:docPr id="2" name="live.jpg" descr="Hình 2. Màn hình tự chuyển sang màn hình kỉ niệm khi đến giờ khai mạc" title="Hình 2. Màn hình tự chuyển sang màn hình kỉ niệm khi đến giờ khai mạc"/>
             <wp:cNvGraphicFramePr>
               <a:graphicFrameLocks xmlns:a="http://schemas.openxmlformats.org/drawingml/2006/main" noChangeAspect="1"/>
             </wp:cNvGraphicFramePr>
@@ -3036,7 +3036,7 @@
           <w:sz w:val="19"/>
           <w:szCs w:val="19"/>
         </w:rPr>
-        <w:t xml:space="preserve">Hình 2. Màn hình tự chuyển sang lời chào khi đến giờ khai mạc</w:t>
+        <w:t xml:space="preserve">Hình 2. Màn hình tự chuyển sang màn hình kỉ niệm khi đến giờ khai mạc</w:t>
       </w:r>
     </w:p>
     <w:p>
@@ -3400,7 +3400,7 @@
               <w:rPr>
                 <w:rFonts w:ascii="Arial" w:cs="Arial" w:eastAsia="Arial" w:hAnsi="Arial"/>
               </w:rPr>
-              <w:t xml:space="preserve">10 giây cuối và lời chào</w:t>
+              <w:t xml:space="preserve">10 giây cuối và màn hình kỉ niệm</w:t>
             </w:r>
           </w:p>
         </w:tc>
@@ -3437,7 +3437,97 @@
           </w:p>
         </w:tc>
       </w:tr>
+      <w:tr>
+        <w:trPr>
+          <w:tblHeader w:val="off"/>
+        </w:trPr>
+        <w:tc>
+          <w:tcPr>
+            <w:tcW w:type="dxa" w:w="4300"/>
+            <w:tcBorders>
+              <w:top w:val="single" w:color="C7D0E0" w:sz="4"/>
+              <w:left w:val="single" w:color="C7D0E0" w:sz="4"/>
+              <w:bottom w:val="single" w:color="C7D0E0" w:sz="4"/>
+              <w:right w:val="single" w:color="C7D0E0" w:sz="4"/>
+            </w:tcBorders>
+            <w:tcMar>
+              <w:top w:type="dxa" w:w="70"/>
+              <w:left w:type="dxa" w:w="110"/>
+              <w:bottom w:type="dxa" w:w="70"/>
+              <w:right w:type="dxa" w:w="110"/>
+            </w:tcMar>
+          </w:tcPr>
+          <w:p>
+            <w:pPr>
+              <w:spacing w:after="40" w:line="270"/>
+            </w:pPr>
+            <w:r>
+              <w:rPr>
+                <w:rFonts w:ascii="Arial" w:cs="Arial" w:eastAsia="Arial" w:hAnsi="Arial"/>
+              </w:rPr>
+              <w:t xml:space="preserve">Ảnh tĩnh "còn 2 ngày", đồng hồ đứng ở 01:12:00:00</w:t>
+            </w:r>
+          </w:p>
+        </w:tc>
+        <w:tc>
+          <w:tcPr>
+            <w:tcW w:type="dxa" w:w="5338"/>
+            <w:tcBorders>
+              <w:top w:val="single" w:color="C7D0E0" w:sz="4"/>
+              <w:left w:val="single" w:color="C7D0E0" w:sz="4"/>
+              <w:bottom w:val="single" w:color="C7D0E0" w:sz="4"/>
+              <w:right w:val="single" w:color="C7D0E0" w:sz="4"/>
+            </w:tcBorders>
+            <w:tcMar>
+              <w:top w:type="dxa" w:w="70"/>
+              <w:left w:type="dxa" w:w="110"/>
+              <w:bottom w:type="dxa" w:w="70"/>
+              <w:right w:type="dxa" w:w="110"/>
+            </w:tcMar>
+          </w:tcPr>
+          <w:p>
+            <w:pPr>
+              <w:spacing w:after="40" w:line="270"/>
+            </w:pPr>
+            <w:r>
+              <w:rPr>
+                <w:rFonts w:ascii="Consolas" w:cs="Consolas" w:eastAsia="Consolas" w:hAnsi="Consolas"/>
+                <w:color w:val="1F2D5A"/>
+                <w:sz w:val="19"/>
+                <w:szCs w:val="19"/>
+              </w:rPr>
+              <w:t xml:space="preserve">?now=2026-10-22T20:30:00%2B07:00&amp;freeze</w:t>
+            </w:r>
+          </w:p>
+        </w:tc>
+      </w:tr>
     </w:tbl>
+    <w:p>
+      <w:pPr>
+        <w:spacing w:after="120" w:line="300"/>
+      </w:pPr>
+      <w:r>
+        <w:rPr>
+          <w:rFonts w:ascii="Arial" w:cs="Arial" w:eastAsia="Arial" w:hAnsi="Arial"/>
+        </w:rPr>
+        <w:t xml:space="preserve">Thêm </w:t>
+      </w:r>
+      <w:r>
+        <w:rPr>
+          <w:rFonts w:ascii="Consolas" w:cs="Consolas" w:eastAsia="Consolas" w:hAnsi="Consolas"/>
+          <w:color w:val="1F2D5A"/>
+          <w:sz w:val="19"/>
+          <w:szCs w:val="19"/>
+        </w:rPr>
+        <w:t xml:space="preserve">&amp;freeze</w:t>
+      </w:r>
+      <w:r>
+        <w:rPr>
+          <w:rFonts w:ascii="Arial" w:cs="Arial" w:eastAsia="Arial" w:hAnsi="Arial"/>
+        </w:rPr>
+        <w:t xml:space="preserve"> để màn hình đứng yên tại đúng thời điểm now, tiện chụp ảnh giới thiệu.</w:t>
+      </w:r>
+    </w:p>
     <w:p>
       <w:pPr>
         <w:pBdr>

</xml_diff>

<commit_message>
Đếm "còn … ngày" theo ngày lịch cho đến hết ngày trước sự kiện
Trước đây chữ lớn chuyển sang giờ ngay khi ô Ngày về 0, nên 9g ngày 23/10
hiện "còn 23 giờ". Nay so ngày lịch hiện tại với ngày sự kiện: còn khác ngày
thì hiện "còn N ngày" (9g ngày 23/10 hiện "còn 1 ngày"), chỉ đến ngày 24/10
mới chuyển sang giờ/phút/giây như cũ.

Cập nhật README và tài liệu Word: bảng diễn biến hiển thị và mốc diễn tập
chuyển "ngày" sang "giờ" (23:59:50 ngày 23/10).

Co-Authored-By: Claude Opus 5.5 <noreply@anthropic.com>
</commit_message>
<xml_diff>
--- a/HUONG-DAN-TRIEN-KHAI.docx
+++ b/HUONG-DAN-TRIEN-KHAI.docx
@@ -2577,7 +2577,7 @@
         <w:rPr>
           <w:rFonts w:ascii="Arial" w:cs="Arial" w:eastAsia="Arial" w:hAnsi="Arial"/>
         </w:rPr>
-        <w:t xml:space="preserve">Bốn ô Ngày, Giờ, Phút, Giây bên phải đếm ngược chính xác. Số lớn bên trái đổi đơn vị theo các ô này: ô Ngày về 0 thì chuyển sang giờ, ô Giờ về 0 thì chuyển sang phút, ô Phút về 0 thì chuyển sang giây.</w:t>
+        <w:t xml:space="preserve">Bốn ô Ngày, Giờ, Phút, Giây bên phải đếm ngược chính xác. Số lớn bên trái tính theo ngày lịch cho đến hết ngày 23/10. Từ 00g00 ngày 24/10 mới đổi đơn vị theo các ô: hiện số giờ, ô Giờ về 0 thì chuyển sang phút, ô Phút về 0 thì chuyển sang giây.</w:t>
       </w:r>
     </w:p>
     <w:tbl>
@@ -2694,7 +2694,7 @@
               <w:rPr>
                 <w:rFonts w:ascii="Arial" w:cs="Arial" w:eastAsia="Arial" w:hAnsi="Arial"/>
               </w:rPr>
-              <w:t xml:space="preserve">Ô Ngày từ 1 trở lên</w:t>
+              <w:t xml:space="preserve">Trước ngày 24/10/2026</w:t>
             </w:r>
           </w:p>
         </w:tc>
@@ -2722,7 +2722,7 @@
               <w:rPr>
                 <w:rFonts w:ascii="Arial" w:cs="Arial" w:eastAsia="Arial" w:hAnsi="Arial"/>
               </w:rPr>
-              <w:t xml:space="preserve">"còn N ngày", N tính theo ngày lịch: hôm nay 22/10 thì hiện "còn 2 ngày" dù đồng hồ còn 1 ngày 12 giờ</w:t>
+              <w:t xml:space="preserve">"còn N ngày", N tính theo ngày lịch: 22/10 hiện "còn 2 ngày", 9g ngày 23/10 vẫn hiện "còn 1 ngày" dù đồng hồ chỉ còn 0 ngày 23 giờ 30 phút</w:t>
             </w:r>
           </w:p>
         </w:tc>
@@ -2756,7 +2756,7 @@
               <w:rPr>
                 <w:rFonts w:ascii="Arial" w:cs="Arial" w:eastAsia="Arial" w:hAnsi="Arial"/>
               </w:rPr>
-              <w:t xml:space="preserve">Ô Ngày = 0</w:t>
+              <w:t xml:space="preserve">Từ 00g00 ngày 24/10/2026</w:t>
             </w:r>
           </w:p>
         </w:tc>
@@ -2818,7 +2818,7 @@
               <w:rPr>
                 <w:rFonts w:ascii="Arial" w:cs="Arial" w:eastAsia="Arial" w:hAnsi="Arial"/>
               </w:rPr>
-              <w:t xml:space="preserve">Ô Ngày, Giờ = 0</w:t>
+              <w:t xml:space="preserve">Ngày 24/10, ô Giờ = 0</w:t>
             </w:r>
           </w:p>
         </w:tc>
@@ -2880,7 +2880,7 @@
               <w:rPr>
                 <w:rFonts w:ascii="Arial" w:cs="Arial" w:eastAsia="Arial" w:hAnsi="Arial"/>
               </w:rPr>
-              <w:t xml:space="preserve">Ô Ngày, Giờ, Phút = 0</w:t>
+              <w:t xml:space="preserve">Ngày 24/10, ô Giờ, Phút = 0</w:t>
             </w:r>
           </w:p>
         </w:tc>
@@ -3236,7 +3236,7 @@
                 <w:sz w:val="19"/>
                 <w:szCs w:val="19"/>
               </w:rPr>
-              <w:t xml:space="preserve">?now=2026-10-23T08:29:50%2B07:00</w:t>
+              <w:t xml:space="preserve">?now=2026-10-23T23:59:50%2B07:00</w:t>
             </w:r>
           </w:p>
         </w:tc>

</xml_diff>

<commit_message>
Dùng ảnh nền thiết kế cho màn hình đếm ngược và màn hình kỉ niệm
- Ảnh nền nen-dem-nguoc.jpg và nen-ki-niem.jpg do designer xuất, đã có logo
  Trường, tiêu đề, tòa nhà và dải logo tài trợ; bỏ phần header, dải tài trợ
  và khối chữ màn hình kỉ niệm dựng bằng HTML
- Trang chỉ còn đặt lên nền cụm "còn … ngày/giờ/phút/giây", 4 ô đếm ngược,
  địa điểm và khẩu hiệu; nạp sẵn nền kỉ niệm để 08g30 chuyển cảnh ngay
- Dưới 60 giây ẩn 4 ô đếm, chỉ còn số giây lớn
- Thay logo PVcomBank, VietinBank bản mới (lưu trữ, trang dùng logo trong
  ảnh nền)
- Cập nhật README, tài liệu Word và ảnh minh họa

Co-Authored-By: Claude Opus 5.5 <noreply@anthropic.com>
</commit_message>
<xml_diff>
--- a/HUONG-DAN-TRIEN-KHAI.docx
+++ b/HUONG-DAN-TRIEN-KHAI.docx
@@ -580,7 +580,7 @@
               <w:rPr>
                 <w:rFonts w:ascii="Arial" w:cs="Arial" w:eastAsia="Arial" w:hAnsi="Arial"/>
               </w:rPr>
-              <w:t xml:space="preserve">Tách từ file thiết kế gốc Countdown.ai (ảnh nền, tòa nhà, chữ 3D, logo); bộ số 3D 0–9 và chữ giờ/phút/giây do designer cung cấp</w:t>
+              <w:t xml:space="preserve">Ảnh nền màn hình đếm ngược và màn hình kỉ niệm (đã có logo Trường, tiêu đề, tòa nhà và dải logo tài trợ), bộ số 3D 0–9 và chữ giờ/phút/giây do designer cung cấp</w:t>
             </w:r>
           </w:p>
         </w:tc>
@@ -846,7 +846,7 @@
               <w:rPr>
                 <w:rFonts w:ascii="Arial" w:cs="Arial" w:eastAsia="Arial" w:hAnsi="Arial"/>
               </w:rPr>
-              <w:t xml:space="preserve">Ảnh nền, hình tòa nhà, bộ số 3D so-0.png … so-9.png, chữ 3D "còn", "ngày", "giờ", "phút", "giây"</w:t>
+              <w:t xml:space="preserve">Ảnh nền nen-dem-nguoc.jpg (đếm ngược) và nen-ki-niem.jpg (từ giờ khai mạc), bộ số 3D so-0.png … so-9.png, chữ 3D "còn", "ngày", "giờ", "phút", "giây"</w:t>
             </w:r>
           </w:p>
         </w:tc>
@@ -907,7 +907,7 @@
               <w:rPr>
                 <w:rFonts w:ascii="Arial" w:cs="Arial" w:eastAsia="Arial" w:hAnsi="Arial"/>
               </w:rPr>
-              <w:t xml:space="preserve">Logo Trường, logo 50 năm và 26 logo đơn vị tài trợ, đánh số theo thứ tự hiển thị</w:t>
+              <w:t xml:space="preserve">Logo Trường, logo 50 năm và 26 logo đơn vị tài trợ dạng file rời để lưu trữ (trang dùng logo có sẵn trong ảnh nền)</w:t>
             </w:r>
           </w:p>
         </w:tc>
@@ -2909,7 +2909,7 @@
               <w:rPr>
                 <w:rFonts w:ascii="Arial" w:cs="Arial" w:eastAsia="Arial" w:hAnsi="Arial"/>
               </w:rPr>
-              <w:t xml:space="preserve">"còn N giây", số nhảy theo từng giây</w:t>
+              <w:t xml:space="preserve">"còn N giây", số nhảy theo từng giây; 4 ô Ngày, Giờ, Phút, Giây ẩn đi, chỉ còn số giây lớn</w:t>
             </w:r>
           </w:p>
         </w:tc>
@@ -3788,7 +3788,7 @@
               <w:rPr>
                 <w:rFonts w:ascii="Arial" w:cs="Arial" w:eastAsia="Arial" w:hAnsi="Arial"/>
               </w:rPr>
-              <w:t xml:space="preserve">Thêm, bớt, đổi thứ tự logo</w:t>
+              <w:t xml:space="preserve">Logo tài trợ, tiêu đề, logo Trường</w:t>
             </w:r>
           </w:p>
         </w:tc>
@@ -3817,22 +3817,7 @@
               <w:rPr>
                 <w:rFonts w:ascii="Arial" w:cs="Arial" w:eastAsia="Arial" w:hAnsi="Arial"/>
               </w:rPr>
-              <w:t xml:space="preserve">Chép file PNG vào logos/, sửa danh sách </w:t>
-            </w:r>
-            <w:r>
-              <w:rPr>
-                <w:rFonts w:ascii="Consolas" w:cs="Consolas" w:eastAsia="Consolas" w:hAnsi="Consolas"/>
-                <w:color w:val="1F2D5A"/>
-                <w:sz w:val="19"/>
-                <w:szCs w:val="19"/>
-              </w:rPr>
-              <w:t xml:space="preserve">SPONSOR_LOGOS</w:t>
-            </w:r>
-            <w:r>
-              <w:rPr>
-                <w:rFonts w:ascii="Arial" w:cs="Arial" w:eastAsia="Arial" w:hAnsi="Arial"/>
-              </w:rPr>
-              <w:t xml:space="preserve"> (ghi tên file, không cần đuôi .png)</w:t>
+              <w:t xml:space="preserve">Nằm sẵn trong 2 ảnh nền assets/nen-dem-nguoc.jpg và assets/nen-ki-niem.jpg. Muốn đổi thì nhờ designer xuất lại ảnh nền cùng tỉ lệ 13:7 (tốt nhất đúng 2080 × 1120), đặt cùng tên đè lên file cũ</w:t>
             </w:r>
           </w:p>
         </w:tc>

</xml_diff>